<commit_message>
moving to using cappglobals
</commit_message>
<xml_diff>
--- a/[docs]/build/installing rapport.docx
+++ b/[docs]/build/installing rapport.docx
@@ -2100,7 +2100,15 @@
     </w:p>
     <w:p>
       <w:r>
-        <w:t>This document describes how to install Rapport on your own windows desktop. However it can be deployed anywhere where you can run a PHP server.</w:t>
+        <w:t xml:space="preserve">This document describes how to install Rapport on your own windows desktop. </w:t>
+      </w:r>
+      <w:proofErr w:type="gramStart"/>
+      <w:r>
+        <w:t>However</w:t>
+      </w:r>
+      <w:proofErr w:type="gramEnd"/>
+      <w:r>
+        <w:t xml:space="preserve"> it can be deployed anywhere where you can run a PHP server.</w:t>
       </w:r>
     </w:p>
     <w:p>
@@ -2163,7 +2171,51 @@
             <w:sz w:val="22"/>
             <w:shd w:val="clear" w:color="auto" w:fill="FFFFFF"/>
           </w:rPr>
-          <w:t>Creative Commons Attribution-NonCommercial-NoDerivatives 4.0 International License</w:t>
+          <w:t>Creative Commons Attribution-</w:t>
+        </w:r>
+        <w:proofErr w:type="spellStart"/>
+        <w:r>
+          <w:rPr>
+            <w:rStyle w:val="Hyperlink"/>
+            <w:rFonts w:cstheme="minorHAnsi"/>
+            <w:color w:val="FF4081"/>
+            <w:sz w:val="22"/>
+            <w:shd w:val="clear" w:color="auto" w:fill="FFFFFF"/>
+          </w:rPr>
+          <w:t>NonCommercial</w:t>
+        </w:r>
+        <w:proofErr w:type="spellEnd"/>
+        <w:r>
+          <w:rPr>
+            <w:rStyle w:val="Hyperlink"/>
+            <w:rFonts w:cstheme="minorHAnsi"/>
+            <w:color w:val="FF4081"/>
+            <w:sz w:val="22"/>
+            <w:shd w:val="clear" w:color="auto" w:fill="FFFFFF"/>
+          </w:rPr>
+          <w:t>-</w:t>
+        </w:r>
+        <w:proofErr w:type="spellStart"/>
+        <w:r>
+          <w:rPr>
+            <w:rStyle w:val="Hyperlink"/>
+            <w:rFonts w:cstheme="minorHAnsi"/>
+            <w:color w:val="FF4081"/>
+            <w:sz w:val="22"/>
+            <w:shd w:val="clear" w:color="auto" w:fill="FFFFFF"/>
+          </w:rPr>
+          <w:t>NoDerivatives</w:t>
+        </w:r>
+        <w:proofErr w:type="spellEnd"/>
+        <w:r>
+          <w:rPr>
+            <w:rStyle w:val="Hyperlink"/>
+            <w:rFonts w:cstheme="minorHAnsi"/>
+            <w:color w:val="FF4081"/>
+            <w:sz w:val="22"/>
+            <w:shd w:val="clear" w:color="auto" w:fill="FFFFFF"/>
+          </w:rPr>
+          <w:t xml:space="preserve"> 4.0 International License</w:t>
         </w:r>
       </w:hyperlink>
       <w:r>
@@ -2327,10 +2379,26 @@
         <w:t>The downloaded file is a self-extracting zip file</w:t>
       </w:r>
       <w:r>
-        <w:t xml:space="preserve"> that runs as a portable application (ie it doesn’t require any installation, just unpack and go) </w:t>
-      </w:r>
-      <w:r>
-        <w:t>. You can extract it yourself into the directory that you want uniserver to run from</w:t>
+        <w:t xml:space="preserve"> that runs as a portable application (</w:t>
+      </w:r>
+      <w:proofErr w:type="spellStart"/>
+      <w:r>
+        <w:t>ie</w:t>
+      </w:r>
+      <w:proofErr w:type="spellEnd"/>
+      <w:r>
+        <w:t xml:space="preserve"> it doesn’t require any installation, just unpack and go</w:t>
+      </w:r>
+      <w:proofErr w:type="gramStart"/>
+      <w:r>
+        <w:t xml:space="preserve">) </w:t>
+      </w:r>
+      <w:r>
+        <w:t>.</w:t>
+      </w:r>
+      <w:proofErr w:type="gramEnd"/>
+      <w:r>
+        <w:t xml:space="preserve"> You can extract it yourself into the directory that you want uniserver to run from</w:t>
       </w:r>
       <w:r>
         <w:t xml:space="preserve">. </w:t>
@@ -2798,7 +2866,15 @@
     <w:p/>
     <w:p>
       <w:r>
-        <w:t>If the apache SSL option is disabled stop Apache first to enable the option.</w:t>
+        <w:t xml:space="preserve">If the </w:t>
+      </w:r>
+      <w:proofErr w:type="spellStart"/>
+      <w:r>
+        <w:t>apache</w:t>
+      </w:r>
+      <w:proofErr w:type="spellEnd"/>
+      <w:r>
+        <w:t xml:space="preserve"> SSL option is disabled stop Apache first to enable the option.</w:t>
       </w:r>
     </w:p>
     <w:p/>
@@ -2884,7 +2960,23 @@
     </w:p>
     <w:p>
       <w:r>
-        <w:t>Without this when you run apache, PHP wont run</w:t>
+        <w:t xml:space="preserve">Without this when you run </w:t>
+      </w:r>
+      <w:proofErr w:type="spellStart"/>
+      <w:r>
+        <w:t>apache</w:t>
+      </w:r>
+      <w:proofErr w:type="spellEnd"/>
+      <w:r>
+        <w:t xml:space="preserve">, PHP </w:t>
+      </w:r>
+      <w:proofErr w:type="spellStart"/>
+      <w:r>
+        <w:t>wont</w:t>
+      </w:r>
+      <w:proofErr w:type="spellEnd"/>
+      <w:r>
+        <w:t xml:space="preserve"> run</w:t>
       </w:r>
     </w:p>
     <w:p>
@@ -3034,7 +3126,31 @@
         <w:t xml:space="preserve">can </w:t>
       </w:r>
       <w:r>
-        <w:t>use the uniserver zero ui to create an ssl virtual host</w:t>
+        <w:t xml:space="preserve">use the uniserver zero </w:t>
+      </w:r>
+      <w:proofErr w:type="spellStart"/>
+      <w:r>
+        <w:t>ui</w:t>
+      </w:r>
+      <w:proofErr w:type="spellEnd"/>
+      <w:r>
+        <w:t xml:space="preserve"> to create </w:t>
+      </w:r>
+      <w:proofErr w:type="gramStart"/>
+      <w:r>
+        <w:t>an</w:t>
+      </w:r>
+      <w:proofErr w:type="gramEnd"/>
+      <w:r>
+        <w:t xml:space="preserve"> </w:t>
+      </w:r>
+      <w:proofErr w:type="spellStart"/>
+      <w:r>
+        <w:t>ssl</w:t>
+      </w:r>
+      <w:proofErr w:type="spellEnd"/>
+      <w:r>
+        <w:t xml:space="preserve"> virtual host</w:t>
       </w:r>
     </w:p>
     <w:p>
@@ -3151,8 +3267,13 @@
       </w:r>
     </w:p>
     <w:p>
-      <w:r>
-        <w:t xml:space="preserve">Eg for </w:t>
+      <w:proofErr w:type="spellStart"/>
+      <w:r>
+        <w:t>Eg</w:t>
+      </w:r>
+      <w:proofErr w:type="spellEnd"/>
+      <w:r>
+        <w:t xml:space="preserve"> for </w:t>
       </w:r>
       <w:r>
         <w:rPr>
@@ -3205,15 +3326,30 @@
         <w:pStyle w:val="code"/>
       </w:pPr>
       <w:r>
-        <w:t>127.0.0.1 dev.rapport</w:t>
-      </w:r>
+        <w:t xml:space="preserve">127.0.0.1 </w:t>
+      </w:r>
+      <w:proofErr w:type="spellStart"/>
+      <w:proofErr w:type="gramStart"/>
+      <w:r>
+        <w:t>dev.rapport</w:t>
+      </w:r>
+      <w:proofErr w:type="spellEnd"/>
+      <w:proofErr w:type="gramEnd"/>
     </w:p>
     <w:p>
       <w:pPr>
         <w:pStyle w:val="Heading4"/>
       </w:pPr>
       <w:r>
-        <w:t>Create a ssl virtual host</w:t>
+        <w:t xml:space="preserve">Create a </w:t>
+      </w:r>
+      <w:proofErr w:type="spellStart"/>
+      <w:r>
+        <w:t>ssl</w:t>
+      </w:r>
+      <w:proofErr w:type="spellEnd"/>
+      <w:r>
+        <w:t xml:space="preserve"> virtual host</w:t>
       </w:r>
     </w:p>
     <w:p>
@@ -3223,15 +3359,52 @@
           <w:ilvl w:val="0"/>
           <w:numId w:val="6"/>
         </w:numPr>
-      </w:pPr>
-      <w:r>
-        <w:t xml:space="preserve">Edit the file </w:t>
-      </w:r>
-      <w:r>
-        <w:t>$APACHE</w:t>
-      </w:r>
-      <w:r>
-        <w:t>/conf/extra/httpd-ssl.conf</w:t>
+        <w:rPr>
+          <w:rFonts w:ascii="Courier New" w:hAnsi="Courier New" w:cs="Courier New"/>
+        </w:rPr>
+      </w:pPr>
+      <w:r>
+        <w:t xml:space="preserve">Create a new conf file under </w:t>
+      </w:r>
+      <w:r>
+        <w:rPr>
+          <w:rFonts w:ascii="Courier New" w:hAnsi="Courier New" w:cs="Courier New"/>
+        </w:rPr>
+        <w:t>$APACHE/conf</w:t>
+      </w:r>
+      <w:r>
+        <w:rPr>
+          <w:rFonts w:ascii="Courier New" w:hAnsi="Courier New" w:cs="Courier New"/>
+        </w:rPr>
+        <w:t xml:space="preserve"> (</w:t>
+      </w:r>
+      <w:proofErr w:type="spellStart"/>
+      <w:r>
+        <w:rPr>
+          <w:rFonts w:ascii="Courier New" w:hAnsi="Courier New" w:cs="Courier New"/>
+        </w:rPr>
+        <w:t>eg</w:t>
+      </w:r>
+      <w:proofErr w:type="spellEnd"/>
+      <w:r>
+        <w:rPr>
+          <w:rFonts w:ascii="Courier New" w:hAnsi="Courier New" w:cs="Courier New"/>
+        </w:rPr>
+        <w:t xml:space="preserve"> </w:t>
+      </w:r>
+      <w:proofErr w:type="spellStart"/>
+      <w:r>
+        <w:rPr>
+          <w:rFonts w:ascii="Courier New" w:hAnsi="Courier New" w:cs="Courier New"/>
+        </w:rPr>
+        <w:t>rapport.conf</w:t>
+      </w:r>
+      <w:proofErr w:type="spellEnd"/>
+      <w:r>
+        <w:rPr>
+          <w:rFonts w:ascii="Courier New" w:hAnsi="Courier New" w:cs="Courier New"/>
+        </w:rPr>
+        <w:t>)</w:t>
       </w:r>
     </w:p>
     <w:p>
@@ -3241,49 +3414,59 @@
           <w:ilvl w:val="0"/>
           <w:numId w:val="6"/>
         </w:numPr>
-      </w:pPr>
-      <w:r>
-        <w:t xml:space="preserve">Copy the </w:t>
-      </w:r>
-      <w:r>
-        <w:t>vhost</w:t>
-      </w:r>
-      <w:r>
-        <w:t xml:space="preserve"> </w:t>
-      </w:r>
-      <w:r>
-        <w:t xml:space="preserve">section </w:t>
-      </w:r>
-    </w:p>
-    <w:p>
-      <w:pPr>
-        <w:pStyle w:val="code"/>
-        <w:ind w:left="720"/>
-      </w:pPr>
-      <w:r>
-        <w:t>&lt;VirtualHost _default_:${AP_SSL_PORT}&gt;</w:t>
-      </w:r>
-    </w:p>
-    <w:p>
-      <w:pPr>
-        <w:pStyle w:val="code"/>
-        <w:ind w:left="720"/>
-      </w:pPr>
-      <w:r>
-        <w:t>…</w:t>
-      </w:r>
-      <w:r>
-        <w:t xml:space="preserve"> </w:t>
-      </w:r>
-    </w:p>
-    <w:p>
-      <w:pPr>
-        <w:pStyle w:val="code"/>
-        <w:ind w:left="720"/>
-      </w:pPr>
-      <w:r>
-        <w:t>&lt;/VirtualHost&gt;</w:t>
-      </w:r>
+        <w:rPr>
+          <w:rFonts w:ascii="Courier New" w:hAnsi="Courier New" w:cs="Courier New"/>
+        </w:rPr>
+      </w:pPr>
+      <w:r>
+        <w:t xml:space="preserve">Add the new conf file as an import in </w:t>
+      </w:r>
+      <w:r>
+        <w:rPr>
+          <w:rFonts w:ascii="Courier New" w:hAnsi="Courier New" w:cs="Courier New"/>
+        </w:rPr>
+        <w:t>$APACHE/conf</w:t>
+      </w:r>
+      <w:r>
+        <w:rPr>
+          <w:rFonts w:ascii="Courier New" w:hAnsi="Courier New" w:cs="Courier New"/>
+        </w:rPr>
+        <w:t>/</w:t>
+      </w:r>
+      <w:proofErr w:type="spellStart"/>
+      <w:r>
+        <w:rPr>
+          <w:rFonts w:ascii="Courier New" w:hAnsi="Courier New" w:cs="Courier New"/>
+        </w:rPr>
+        <w:t>httpd.conf</w:t>
+      </w:r>
+      <w:proofErr w:type="spellEnd"/>
+    </w:p>
+    <w:p>
+      <w:pPr>
+        <w:pStyle w:val="ListParagraph"/>
+        <w:numPr>
+          <w:ilvl w:val="1"/>
+          <w:numId w:val="6"/>
+        </w:numPr>
+        <w:rPr>
+          <w:rFonts w:ascii="Courier New" w:hAnsi="Courier New" w:cs="Courier New"/>
+        </w:rPr>
+      </w:pPr>
+      <w:r>
+        <w:rPr>
+          <w:rFonts w:ascii="Courier New" w:hAnsi="Courier New" w:cs="Courier New"/>
+        </w:rPr>
+        <w:t>Include conf/</w:t>
+      </w:r>
+      <w:proofErr w:type="spellStart"/>
+      <w:r>
+        <w:rPr>
+          <w:rFonts w:ascii="Courier New" w:hAnsi="Courier New" w:cs="Courier New"/>
+        </w:rPr>
+        <w:t>rapport.conf</w:t>
+      </w:r>
+      <w:proofErr w:type="spellEnd"/>
     </w:p>
     <w:p>
       <w:pPr>
@@ -3292,6 +3475,113 @@
           <w:ilvl w:val="0"/>
           <w:numId w:val="6"/>
         </w:numPr>
+      </w:pPr>
+      <w:r>
+        <w:t xml:space="preserve">Copy the </w:t>
+      </w:r>
+      <w:r>
+        <w:t>vhost</w:t>
+      </w:r>
+      <w:r>
+        <w:t xml:space="preserve"> </w:t>
+      </w:r>
+      <w:proofErr w:type="gramStart"/>
+      <w:r>
+        <w:t xml:space="preserve">section </w:t>
+      </w:r>
+      <w:r>
+        <w:t xml:space="preserve"> from</w:t>
+      </w:r>
+      <w:proofErr w:type="gramEnd"/>
+      <w:r>
+        <w:t xml:space="preserve">  </w:t>
+      </w:r>
+      <w:r>
+        <w:rPr>
+          <w:rFonts w:ascii="Courier New" w:hAnsi="Courier New" w:cs="Courier New"/>
+        </w:rPr>
+        <w:t>$APACHE/conf/extra/httpd-</w:t>
+      </w:r>
+      <w:proofErr w:type="spellStart"/>
+      <w:r>
+        <w:rPr>
+          <w:rFonts w:ascii="Courier New" w:hAnsi="Courier New" w:cs="Courier New"/>
+        </w:rPr>
+        <w:t>ssl.conf</w:t>
+      </w:r>
+      <w:proofErr w:type="spellEnd"/>
+      <w:r>
+        <w:rPr>
+          <w:rFonts w:ascii="Courier New" w:hAnsi="Courier New" w:cs="Courier New"/>
+        </w:rPr>
+        <w:t xml:space="preserve"> </w:t>
+      </w:r>
+      <w:r>
+        <w:t xml:space="preserve">into the </w:t>
+      </w:r>
+      <w:proofErr w:type="spellStart"/>
+      <w:r>
+        <w:rPr>
+          <w:rFonts w:ascii="Courier New" w:hAnsi="Courier New" w:cs="Courier New"/>
+        </w:rPr>
+        <w:t>rapport.conf</w:t>
+      </w:r>
+      <w:proofErr w:type="spellEnd"/>
+      <w:r>
+        <w:rPr>
+          <w:rFonts w:ascii="Courier New" w:hAnsi="Courier New" w:cs="Courier New"/>
+        </w:rPr>
+        <w:t xml:space="preserve"> </w:t>
+      </w:r>
+      <w:r>
+        <w:t>file</w:t>
+      </w:r>
+    </w:p>
+    <w:p>
+      <w:pPr>
+        <w:pStyle w:val="code"/>
+        <w:ind w:left="720"/>
+      </w:pPr>
+      <w:r>
+        <w:t>&lt;VirtualHost _default</w:t>
+      </w:r>
+      <w:proofErr w:type="gramStart"/>
+      <w:r>
+        <w:t>_:$</w:t>
+      </w:r>
+      <w:proofErr w:type="gramEnd"/>
+      <w:r>
+        <w:t>{AP_SSL_PORT}&gt;</w:t>
+      </w:r>
+    </w:p>
+    <w:p>
+      <w:pPr>
+        <w:pStyle w:val="code"/>
+        <w:ind w:left="720"/>
+      </w:pPr>
+      <w:r>
+        <w:t>…</w:t>
+      </w:r>
+      <w:r>
+        <w:t xml:space="preserve"> </w:t>
+      </w:r>
+    </w:p>
+    <w:p>
+      <w:pPr>
+        <w:pStyle w:val="code"/>
+        <w:ind w:left="720"/>
+      </w:pPr>
+      <w:r>
+        <w:t>&lt;/VirtualHost&gt;</w:t>
+      </w:r>
+    </w:p>
+    <w:p>
+      <w:pPr>
+        <w:pStyle w:val="ListParagraph"/>
+        <w:numPr>
+          <w:ilvl w:val="0"/>
+          <w:numId w:val="6"/>
+        </w:numPr>
         <w:rPr>
           <w:rStyle w:val="codeChar"/>
           <w:rFonts w:asciiTheme="minorHAnsi" w:eastAsiaTheme="minorHAnsi" w:hAnsiTheme="minorHAnsi"/>
@@ -3303,11 +3593,21 @@
       <w:r>
         <w:t xml:space="preserve">Paste the vhost section changing the label to </w:t>
       </w:r>
+      <w:proofErr w:type="spellStart"/>
+      <w:proofErr w:type="gramStart"/>
       <w:r>
         <w:rPr>
           <w:rStyle w:val="codeChar"/>
         </w:rPr>
-        <w:t>dev.rapport:${AP_SSL_PORT}</w:t>
+        <w:t>dev.rapport</w:t>
+      </w:r>
+      <w:proofErr w:type="spellEnd"/>
+      <w:proofErr w:type="gramEnd"/>
+      <w:r>
+        <w:rPr>
+          <w:rStyle w:val="codeChar"/>
+        </w:rPr>
+        <w:t>:${AP_SSL_PORT}</w:t>
       </w:r>
     </w:p>
     <w:p>
@@ -3319,7 +3619,17 @@
         </w:numPr>
       </w:pPr>
       <w:r>
-        <w:t xml:space="preserve">In the new dev.rapport vhost section </w:t>
+        <w:t xml:space="preserve">In the new </w:t>
+      </w:r>
+      <w:proofErr w:type="spellStart"/>
+      <w:proofErr w:type="gramStart"/>
+      <w:r>
+        <w:t>dev.rapport</w:t>
+      </w:r>
+      <w:proofErr w:type="spellEnd"/>
+      <w:proofErr w:type="gramEnd"/>
+      <w:r>
+        <w:t xml:space="preserve"> vhost section </w:t>
       </w:r>
       <w:r>
         <w:t>change the following</w:t>
@@ -3331,7 +3641,17 @@
         <w:ind w:left="576"/>
       </w:pPr>
       <w:r>
-        <w:t>&lt;VirtualHost dev.rapport:${AP_SSL_PORT}&gt;</w:t>
+        <w:t xml:space="preserve">&lt;VirtualHost </w:t>
+      </w:r>
+      <w:proofErr w:type="spellStart"/>
+      <w:proofErr w:type="gramStart"/>
+      <w:r>
+        <w:t>dev.rapport</w:t>
+      </w:r>
+      <w:proofErr w:type="spellEnd"/>
+      <w:proofErr w:type="gramEnd"/>
+      <w:r>
+        <w:t>:${AP_SSL_PORT}&gt;</w:t>
       </w:r>
     </w:p>
     <w:p>
@@ -3339,8 +3659,21 @@
         <w:pStyle w:val="code"/>
         <w:ind w:left="576"/>
       </w:pPr>
-      <w:r>
-        <w:t>ErrorLog "${US_ROOTF}/core/apache2/logs/rapport_error_ssl.log"</w:t>
+      <w:proofErr w:type="spellStart"/>
+      <w:r>
+        <w:t>ErrorLog</w:t>
+      </w:r>
+      <w:proofErr w:type="spellEnd"/>
+      <w:r>
+        <w:t xml:space="preserve"> "${US_</w:t>
+      </w:r>
+      <w:proofErr w:type="gramStart"/>
+      <w:r>
+        <w:t>ROOTF}/core/apache2/logs/rapport_error_ssl.log</w:t>
+      </w:r>
+      <w:proofErr w:type="gramEnd"/>
+      <w:r>
+        <w:t>"</w:t>
       </w:r>
     </w:p>
     <w:p>
@@ -3348,12 +3681,32 @@
         <w:pStyle w:val="code"/>
         <w:ind w:left="576"/>
       </w:pPr>
-      <w:r>
-        <w:t>TransferLog "${US_ROOTF}/core/apache2/logs/rapport_access_ssl.log"</w:t>
+      <w:proofErr w:type="spellStart"/>
+      <w:r>
+        <w:t>TransferLog</w:t>
+      </w:r>
+      <w:proofErr w:type="spellEnd"/>
+      <w:r>
+        <w:t xml:space="preserve"> "${US_</w:t>
+      </w:r>
+      <w:proofErr w:type="gramStart"/>
+      <w:r>
+        <w:t>ROOTF}/core/apache2/logs/rapport_access_ssl.log</w:t>
+      </w:r>
+      <w:proofErr w:type="gramEnd"/>
+      <w:r>
+        <w:t>"</w:t>
       </w:r>
       <w:r>
         <w:br/>
-        <w:t>DocumentRoot "</w:t>
+      </w:r>
+      <w:proofErr w:type="spellStart"/>
+      <w:r>
+        <w:t>DocumentRoot</w:t>
+      </w:r>
+      <w:proofErr w:type="spellEnd"/>
+      <w:r>
+        <w:t xml:space="preserve"> "</w:t>
       </w:r>
       <w:r>
         <w:rPr>
@@ -3370,8 +3723,23 @@
         <w:pStyle w:val="code"/>
         <w:ind w:left="576"/>
       </w:pPr>
-      <w:r>
-        <w:t>ServerName "dev.rapport"</w:t>
+      <w:proofErr w:type="spellStart"/>
+      <w:r>
+        <w:t>ServerName</w:t>
+      </w:r>
+      <w:proofErr w:type="spellEnd"/>
+      <w:r>
+        <w:t xml:space="preserve"> "</w:t>
+      </w:r>
+      <w:proofErr w:type="spellStart"/>
+      <w:proofErr w:type="gramStart"/>
+      <w:r>
+        <w:t>dev.rapport</w:t>
+      </w:r>
+      <w:proofErr w:type="spellEnd"/>
+      <w:proofErr w:type="gramEnd"/>
+      <w:r>
+        <w:t>"</w:t>
       </w:r>
     </w:p>
     <w:p>
@@ -3406,7 +3774,15 @@
         <w:pStyle w:val="Heading4"/>
       </w:pPr>
       <w:r>
-        <w:t>Do an apache syntax check</w:t>
+        <w:t xml:space="preserve">Do an </w:t>
+      </w:r>
+      <w:proofErr w:type="spellStart"/>
+      <w:r>
+        <w:t>apache</w:t>
+      </w:r>
+      <w:proofErr w:type="spellEnd"/>
+      <w:r>
+        <w:t xml:space="preserve"> syntax check</w:t>
       </w:r>
     </w:p>
     <w:p>
@@ -3422,6 +3798,7 @@
         <w:rPr>
           <w:noProof/>
         </w:rPr>
+        <w:lastRenderedPageBreak/>
         <mc:AlternateContent>
           <mc:Choice Requires="wpc">
             <w:drawing>
@@ -3553,7 +3930,6 @@
         </w:rPr>
       </w:pPr>
       <w:r>
-        <w:lastRenderedPageBreak/>
         <w:br w:type="page"/>
       </w:r>
     </w:p>
@@ -3581,11 +3957,30 @@
           <w:numId w:val="2"/>
         </w:numPr>
       </w:pPr>
-      <w:r>
+      <w:proofErr w:type="spellStart"/>
+      <w:r>
+        <w:rPr>
+          <w:rFonts w:ascii="Courier New" w:hAnsi="Courier New" w:cs="Courier New"/>
+        </w:rPr>
         <w:t>a</w:t>
       </w:r>
       <w:r>
-        <w:t>ppdinc – php classes to interrogate the AppDynamics ®™ APIs</w:t>
+        <w:rPr>
+          <w:rFonts w:ascii="Courier New" w:hAnsi="Courier New" w:cs="Courier New"/>
+        </w:rPr>
+        <w:t>ppdinc</w:t>
+      </w:r>
+      <w:proofErr w:type="spellEnd"/>
+      <w:r>
+        <w:t xml:space="preserve"> – </w:t>
+      </w:r>
+      <w:proofErr w:type="spellStart"/>
+      <w:r>
+        <w:t>php</w:t>
+      </w:r>
+      <w:proofErr w:type="spellEnd"/>
+      <w:r>
+        <w:t xml:space="preserve"> classes to interrogate the AppDynamics ®™ APIs</w:t>
       </w:r>
     </w:p>
     <w:p>
@@ -3596,11 +3991,22 @@
           <w:numId w:val="2"/>
         </w:numPr>
       </w:pPr>
-      <w:r>
+      <w:proofErr w:type="spellStart"/>
+      <w:r>
+        <w:rPr>
+          <w:rFonts w:ascii="Courier New" w:hAnsi="Courier New" w:cs="Courier New"/>
+        </w:rPr>
         <w:t>p</w:t>
       </w:r>
       <w:r>
-        <w:t>hpinc – useful PHP functions</w:t>
+        <w:rPr>
+          <w:rFonts w:ascii="Courier New" w:hAnsi="Courier New" w:cs="Courier New"/>
+        </w:rPr>
+        <w:t>hpinc</w:t>
+      </w:r>
+      <w:proofErr w:type="spellEnd"/>
+      <w:r>
+        <w:t xml:space="preserve"> – useful PHP functions</w:t>
       </w:r>
     </w:p>
     <w:p>
@@ -3611,11 +4017,30 @@
           <w:numId w:val="2"/>
         </w:numPr>
       </w:pPr>
-      <w:r>
+      <w:proofErr w:type="spellStart"/>
+      <w:r>
+        <w:rPr>
+          <w:rFonts w:ascii="Courier New" w:hAnsi="Courier New" w:cs="Courier New"/>
+        </w:rPr>
         <w:t>j</w:t>
       </w:r>
       <w:r>
-        <w:t>sinc – useful javascript functions</w:t>
+        <w:rPr>
+          <w:rFonts w:ascii="Courier New" w:hAnsi="Courier New" w:cs="Courier New"/>
+        </w:rPr>
+        <w:t>sinc</w:t>
+      </w:r>
+      <w:proofErr w:type="spellEnd"/>
+      <w:r>
+        <w:t xml:space="preserve"> – useful </w:t>
+      </w:r>
+      <w:proofErr w:type="spellStart"/>
+      <w:r>
+        <w:t>javascript</w:t>
+      </w:r>
+      <w:proofErr w:type="spellEnd"/>
+      <w:r>
+        <w:t xml:space="preserve"> functions</w:t>
       </w:r>
     </w:p>
     <w:p>
@@ -3627,13 +4052,19 @@
         </w:numPr>
       </w:pPr>
       <w:r>
-        <w:t>r</w:t>
-      </w:r>
-      <w:r>
-        <w:t xml:space="preserve">apport – the </w:t>
-      </w:r>
-      <w:r>
-        <w:t>rapport web application</w:t>
+        <w:rPr>
+          <w:rFonts w:ascii="Courier New" w:hAnsi="Courier New" w:cs="Courier New"/>
+        </w:rPr>
+        <w:t>app</w:t>
+      </w:r>
+      <w:r>
+        <w:t xml:space="preserve"> </w:t>
+      </w:r>
+      <w:r>
+        <w:t xml:space="preserve">– </w:t>
+      </w:r>
+      <w:r>
+        <w:t>where the rapport app lives</w:t>
       </w:r>
     </w:p>
     <w:p>
@@ -3644,32 +4075,102 @@
         <w:t>w</w:t>
       </w:r>
       <w:r>
-        <w:t>ill also need something to be able to clone gi</w:t>
+        <w:t xml:space="preserve">ill also need something to be able to clone </w:t>
+      </w:r>
+      <w:proofErr w:type="spellStart"/>
+      <w:r>
+        <w:t>gi</w:t>
       </w:r>
       <w:r>
         <w:t>t</w:t>
       </w:r>
       <w:r>
-        <w:t xml:space="preserve">hub repos. I recommend using </w:t>
-      </w:r>
-      <w:hyperlink r:id="rId22" w:history="1">
-        <w:r>
-          <w:rPr>
-            <w:rStyle w:val="Hyperlink"/>
-          </w:rPr>
-          <w:t>github desktop</w:t>
-        </w:r>
-      </w:hyperlink>
+        <w:t>hub</w:t>
+      </w:r>
+      <w:proofErr w:type="spellEnd"/>
+      <w:r>
+        <w:t xml:space="preserve"> repos. I recommend using </w:t>
+      </w:r>
+      <w:proofErr w:type="spellStart"/>
+      <w:r>
+        <w:t>vscode</w:t>
+      </w:r>
+      <w:proofErr w:type="spellEnd"/>
       <w:r>
         <w:t xml:space="preserve"> for developing</w:t>
       </w:r>
       <w:r>
         <w:t>.</w:t>
       </w:r>
-      <w:r>
-        <w:t xml:space="preserve"> But if you just want to download just use a web browser</w:t>
-      </w:r>
-    </w:p>
+    </w:p>
+    <w:p>
+      <w:r>
+        <w:t>I</w:t>
+      </w:r>
+      <w:r>
+        <w:t xml:space="preserve">f these subdirectories do not exist relative to each other, their locations will need to be </w:t>
+      </w:r>
+      <w:proofErr w:type="gramStart"/>
+      <w:r>
+        <w:t>defined  in</w:t>
+      </w:r>
+      <w:proofErr w:type="gramEnd"/>
+      <w:r>
+        <w:t xml:space="preserve"> </w:t>
+      </w:r>
+    </w:p>
+    <w:p>
+      <w:pPr>
+        <w:rPr>
+          <w:rFonts w:ascii="Courier New" w:hAnsi="Courier New" w:cs="Courier New"/>
+        </w:rPr>
+      </w:pPr>
+      <w:proofErr w:type="spellStart"/>
+      <w:r>
+        <w:rPr>
+          <w:rFonts w:ascii="Courier New" w:hAnsi="Courier New" w:cs="Courier New"/>
+        </w:rPr>
+        <w:t>inc</w:t>
+      </w:r>
+      <w:proofErr w:type="spellEnd"/>
+      <w:r>
+        <w:rPr>
+          <w:rFonts w:ascii="Courier New" w:hAnsi="Courier New" w:cs="Courier New"/>
+        </w:rPr>
+        <w:t>/</w:t>
+      </w:r>
+      <w:proofErr w:type="spellStart"/>
+      <w:r>
+        <w:rPr>
+          <w:rFonts w:ascii="Courier New" w:hAnsi="Courier New" w:cs="Courier New"/>
+        </w:rPr>
+        <w:t>root.php</w:t>
+      </w:r>
+      <w:proofErr w:type="spellEnd"/>
+      <w:r>
+        <w:rPr>
+          <w:rFonts w:ascii="Courier New" w:hAnsi="Courier New" w:cs="Courier New"/>
+        </w:rPr>
+        <w:t xml:space="preserve">. </w:t>
+      </w:r>
+      <w:r>
+        <w:t xml:space="preserve">for </w:t>
+      </w:r>
+      <w:proofErr w:type="spellStart"/>
+      <w:proofErr w:type="gramStart"/>
+      <w:r>
+        <w:t>jsinc</w:t>
+      </w:r>
+      <w:proofErr w:type="spellEnd"/>
+      <w:r>
+        <w:t xml:space="preserve">  an</w:t>
+      </w:r>
+      <w:proofErr w:type="gramEnd"/>
+      <w:r>
+        <w:t xml:space="preserve"> alias will need to be set in </w:t>
+      </w:r>
+    </w:p>
+    <w:p/>
     <w:p>
       <w:pPr>
         <w:pStyle w:val="Heading2"/>
@@ -3781,7 +4282,7 @@
                 <w:szCs w:val="18"/>
               </w:rPr>
             </w:pPr>
-            <w:hyperlink r:id="rId23" w:history="1">
+            <w:hyperlink r:id="rId22" w:history="1">
               <w:r>
                 <w:rPr>
                   <w:rStyle w:val="Hyperlink"/>
@@ -3800,9 +4301,11 @@
         <w:pStyle w:val="Heading2"/>
       </w:pPr>
       <w:bookmarkStart w:id="16" w:name="_Toc97931553"/>
+      <w:proofErr w:type="spellStart"/>
       <w:r>
         <w:t>phpinc</w:t>
       </w:r>
+      <w:proofErr w:type="spellEnd"/>
       <w:r>
         <w:t xml:space="preserve"> dependencies</w:t>
       </w:r>
@@ -3895,13 +4398,23 @@
               </w:rPr>
               <w:t>/</w:t>
             </w:r>
-            <w:r>
-              <w:rPr>
-                <w:b w:val="0"/>
-                <w:sz w:val="18"/>
-                <w:szCs w:val="18"/>
-              </w:rPr>
-              <w:t>phpinc/</w:t>
+            <w:proofErr w:type="spellStart"/>
+            <w:r>
+              <w:rPr>
+                <w:b w:val="0"/>
+                <w:sz w:val="18"/>
+                <w:szCs w:val="18"/>
+              </w:rPr>
+              <w:t>phpinc</w:t>
+            </w:r>
+            <w:proofErr w:type="spellEnd"/>
+            <w:r>
+              <w:rPr>
+                <w:b w:val="0"/>
+                <w:sz w:val="18"/>
+                <w:szCs w:val="18"/>
+              </w:rPr>
+              <w:t>/</w:t>
             </w:r>
           </w:p>
         </w:tc>
@@ -3917,7 +4430,7 @@
                 <w:szCs w:val="18"/>
               </w:rPr>
             </w:pPr>
-            <w:hyperlink r:id="rId24" w:history="1">
+            <w:hyperlink r:id="rId23" w:history="1">
               <w:r>
                 <w:rPr>
                   <w:rStyle w:val="Hyperlink"/>
@@ -3960,21 +4473,41 @@
               </w:rPr>
               <w:t>/</w:t>
             </w:r>
-            <w:r>
-              <w:rPr>
-                <w:b w:val="0"/>
-                <w:sz w:val="18"/>
-                <w:szCs w:val="18"/>
-              </w:rPr>
-              <w:t>phpinc/</w:t>
-            </w:r>
-            <w:r>
-              <w:rPr>
-                <w:b w:val="0"/>
-                <w:sz w:val="18"/>
-                <w:szCs w:val="18"/>
-              </w:rPr>
-              <w:t>appd/</w:t>
+            <w:proofErr w:type="spellStart"/>
+            <w:r>
+              <w:rPr>
+                <w:b w:val="0"/>
+                <w:sz w:val="18"/>
+                <w:szCs w:val="18"/>
+              </w:rPr>
+              <w:t>phpinc</w:t>
+            </w:r>
+            <w:proofErr w:type="spellEnd"/>
+            <w:r>
+              <w:rPr>
+                <w:b w:val="0"/>
+                <w:sz w:val="18"/>
+                <w:szCs w:val="18"/>
+              </w:rPr>
+              <w:t>/</w:t>
+            </w:r>
+            <w:proofErr w:type="spellStart"/>
+            <w:r>
+              <w:rPr>
+                <w:b w:val="0"/>
+                <w:sz w:val="18"/>
+                <w:szCs w:val="18"/>
+              </w:rPr>
+              <w:t>appd</w:t>
+            </w:r>
+            <w:proofErr w:type="spellEnd"/>
+            <w:r>
+              <w:rPr>
+                <w:b w:val="0"/>
+                <w:sz w:val="18"/>
+                <w:szCs w:val="18"/>
+              </w:rPr>
+              <w:t>/</w:t>
             </w:r>
           </w:p>
         </w:tc>
@@ -3990,7 +4523,7 @@
                 <w:szCs w:val="18"/>
               </w:rPr>
             </w:pPr>
-            <w:hyperlink r:id="rId25" w:history="1">
+            <w:hyperlink r:id="rId24" w:history="1">
               <w:r>
                 <w:rPr>
                   <w:rStyle w:val="Hyperlink"/>
@@ -4033,22 +4566,78 @@
               </w:rPr>
               <w:t>/</w:t>
             </w:r>
-            <w:r>
-              <w:rPr>
-                <w:b w:val="0"/>
-                <w:sz w:val="18"/>
-                <w:szCs w:val="18"/>
-              </w:rPr>
-              <w:t>phpinc/</w:t>
-            </w:r>
-            <w:r>
-              <w:rPr>
-                <w:b w:val="0"/>
-                <w:sz w:val="18"/>
-                <w:szCs w:val="18"/>
-              </w:rPr>
-              <w:t>extra/php-openssl-crypt/cryptor.php</w:t>
-            </w:r>
+            <w:proofErr w:type="spellStart"/>
+            <w:r>
+              <w:rPr>
+                <w:b w:val="0"/>
+                <w:sz w:val="18"/>
+                <w:szCs w:val="18"/>
+              </w:rPr>
+              <w:t>phpinc</w:t>
+            </w:r>
+            <w:proofErr w:type="spellEnd"/>
+            <w:r>
+              <w:rPr>
+                <w:b w:val="0"/>
+                <w:sz w:val="18"/>
+                <w:szCs w:val="18"/>
+              </w:rPr>
+              <w:t>/</w:t>
+            </w:r>
+            <w:r>
+              <w:rPr>
+                <w:b w:val="0"/>
+                <w:sz w:val="18"/>
+                <w:szCs w:val="18"/>
+              </w:rPr>
+              <w:t>extra/</w:t>
+            </w:r>
+            <w:proofErr w:type="spellStart"/>
+            <w:r>
+              <w:rPr>
+                <w:b w:val="0"/>
+                <w:sz w:val="18"/>
+                <w:szCs w:val="18"/>
+              </w:rPr>
+              <w:t>php</w:t>
+            </w:r>
+            <w:proofErr w:type="spellEnd"/>
+            <w:r>
+              <w:rPr>
+                <w:b w:val="0"/>
+                <w:sz w:val="18"/>
+                <w:szCs w:val="18"/>
+              </w:rPr>
+              <w:t>-</w:t>
+            </w:r>
+            <w:proofErr w:type="spellStart"/>
+            <w:r>
+              <w:rPr>
+                <w:b w:val="0"/>
+                <w:sz w:val="18"/>
+                <w:szCs w:val="18"/>
+              </w:rPr>
+              <w:t>openssl</w:t>
+            </w:r>
+            <w:proofErr w:type="spellEnd"/>
+            <w:r>
+              <w:rPr>
+                <w:b w:val="0"/>
+                <w:sz w:val="18"/>
+                <w:szCs w:val="18"/>
+              </w:rPr>
+              <w:t>-crypt/</w:t>
+            </w:r>
+            <w:proofErr w:type="spellStart"/>
+            <w:r>
+              <w:rPr>
+                <w:b w:val="0"/>
+                <w:sz w:val="18"/>
+                <w:szCs w:val="18"/>
+              </w:rPr>
+              <w:t>cryptor.php</w:t>
+            </w:r>
+            <w:proofErr w:type="spellEnd"/>
           </w:p>
         </w:tc>
         <w:tc>
@@ -4079,8 +4668,13 @@
         <w:pStyle w:val="Heading2"/>
       </w:pPr>
       <w:bookmarkStart w:id="17" w:name="_Toc97931554"/>
-      <w:r>
-        <w:t xml:space="preserve">jsinc </w:t>
+      <w:proofErr w:type="spellStart"/>
+      <w:r>
+        <w:t>jsinc</w:t>
+      </w:r>
+      <w:proofErr w:type="spellEnd"/>
+      <w:r>
+        <w:t xml:space="preserve"> </w:t>
       </w:r>
       <w:r>
         <w:t>dependencies</w:t>
@@ -4182,13 +4776,23 @@
               </w:rPr>
               <w:t>/</w:t>
             </w:r>
-            <w:r>
-              <w:rPr>
-                <w:b w:val="0"/>
-                <w:sz w:val="18"/>
-                <w:szCs w:val="18"/>
-              </w:rPr>
-              <w:t>jsinc/</w:t>
+            <w:proofErr w:type="spellStart"/>
+            <w:r>
+              <w:rPr>
+                <w:b w:val="0"/>
+                <w:sz w:val="18"/>
+                <w:szCs w:val="18"/>
+              </w:rPr>
+              <w:t>jsinc</w:t>
+            </w:r>
+            <w:proofErr w:type="spellEnd"/>
+            <w:r>
+              <w:rPr>
+                <w:b w:val="0"/>
+                <w:sz w:val="18"/>
+                <w:szCs w:val="18"/>
+              </w:rPr>
+              <w:t>/</w:t>
             </w:r>
           </w:p>
         </w:tc>
@@ -4204,7 +4808,7 @@
                 <w:szCs w:val="18"/>
               </w:rPr>
             </w:pPr>
-            <w:hyperlink r:id="rId26" w:history="1">
+            <w:hyperlink r:id="rId25" w:history="1">
               <w:r>
                 <w:rPr>
                   <w:rStyle w:val="Hyperlink"/>
@@ -4247,13 +4851,23 @@
               </w:rPr>
               <w:t>/</w:t>
             </w:r>
-            <w:r>
-              <w:rPr>
-                <w:b w:val="0"/>
-                <w:sz w:val="18"/>
-                <w:szCs w:val="18"/>
-              </w:rPr>
-              <w:t>jsinc/</w:t>
+            <w:proofErr w:type="spellStart"/>
+            <w:r>
+              <w:rPr>
+                <w:b w:val="0"/>
+                <w:sz w:val="18"/>
+                <w:szCs w:val="18"/>
+              </w:rPr>
+              <w:t>jsinc</w:t>
+            </w:r>
+            <w:proofErr w:type="spellEnd"/>
+            <w:r>
+              <w:rPr>
+                <w:b w:val="0"/>
+                <w:sz w:val="18"/>
+                <w:szCs w:val="18"/>
+              </w:rPr>
+              <w:t>/</w:t>
             </w:r>
             <w:r>
               <w:rPr>
@@ -4263,13 +4877,23 @@
               </w:rPr>
               <w:t>extra/</w:t>
             </w:r>
-            <w:r>
-              <w:rPr>
-                <w:b w:val="0"/>
-                <w:sz w:val="18"/>
-                <w:szCs w:val="18"/>
-              </w:rPr>
-              <w:t>jquery/jquery-3.2.1.min.js</w:t>
+            <w:proofErr w:type="spellStart"/>
+            <w:r>
+              <w:rPr>
+                <w:b w:val="0"/>
+                <w:sz w:val="18"/>
+                <w:szCs w:val="18"/>
+              </w:rPr>
+              <w:t>jquery</w:t>
+            </w:r>
+            <w:proofErr w:type="spellEnd"/>
+            <w:r>
+              <w:rPr>
+                <w:b w:val="0"/>
+                <w:sz w:val="18"/>
+                <w:szCs w:val="18"/>
+              </w:rPr>
+              <w:t>/jquery-3.2.1.min.js</w:t>
             </w:r>
           </w:p>
         </w:tc>
@@ -4325,13 +4949,23 @@
               </w:rPr>
               <w:t>/</w:t>
             </w:r>
-            <w:r>
-              <w:rPr>
-                <w:b w:val="0"/>
-                <w:sz w:val="18"/>
-                <w:szCs w:val="18"/>
-              </w:rPr>
-              <w:t>jsinc/</w:t>
+            <w:proofErr w:type="spellStart"/>
+            <w:r>
+              <w:rPr>
+                <w:b w:val="0"/>
+                <w:sz w:val="18"/>
+                <w:szCs w:val="18"/>
+              </w:rPr>
+              <w:t>jsinc</w:t>
+            </w:r>
+            <w:proofErr w:type="spellEnd"/>
+            <w:r>
+              <w:rPr>
+                <w:b w:val="0"/>
+                <w:sz w:val="18"/>
+                <w:szCs w:val="18"/>
+              </w:rPr>
+              <w:t>/</w:t>
             </w:r>
             <w:r>
               <w:rPr>
@@ -4341,13 +4975,23 @@
               </w:rPr>
               <w:t>extra/</w:t>
             </w:r>
-            <w:r>
-              <w:rPr>
-                <w:b w:val="0"/>
-                <w:sz w:val="18"/>
-                <w:szCs w:val="18"/>
-              </w:rPr>
-              <w:t>jquery-ui/jquery-ui.min.js</w:t>
+            <w:proofErr w:type="spellStart"/>
+            <w:r>
+              <w:rPr>
+                <w:b w:val="0"/>
+                <w:sz w:val="18"/>
+                <w:szCs w:val="18"/>
+              </w:rPr>
+              <w:t>jquery-ui</w:t>
+            </w:r>
+            <w:proofErr w:type="spellEnd"/>
+            <w:r>
+              <w:rPr>
+                <w:b w:val="0"/>
+                <w:sz w:val="18"/>
+                <w:szCs w:val="18"/>
+              </w:rPr>
+              <w:t>/jquery-ui.min.js</w:t>
             </w:r>
           </w:p>
         </w:tc>
@@ -4403,13 +5047,23 @@
               </w:rPr>
               <w:t>/</w:t>
             </w:r>
-            <w:r>
-              <w:rPr>
-                <w:b w:val="0"/>
-                <w:sz w:val="18"/>
-                <w:szCs w:val="18"/>
-              </w:rPr>
-              <w:t>jsinc/</w:t>
+            <w:proofErr w:type="spellStart"/>
+            <w:r>
+              <w:rPr>
+                <w:b w:val="0"/>
+                <w:sz w:val="18"/>
+                <w:szCs w:val="18"/>
+              </w:rPr>
+              <w:t>jsinc</w:t>
+            </w:r>
+            <w:proofErr w:type="spellEnd"/>
+            <w:r>
+              <w:rPr>
+                <w:b w:val="0"/>
+                <w:sz w:val="18"/>
+                <w:szCs w:val="18"/>
+              </w:rPr>
+              <w:t>/</w:t>
             </w:r>
             <w:r>
               <w:rPr>
@@ -4419,13 +5073,23 @@
               </w:rPr>
               <w:t>extra/</w:t>
             </w:r>
-            <w:r>
-              <w:rPr>
-                <w:b w:val="0"/>
-                <w:sz w:val="18"/>
-                <w:szCs w:val="18"/>
-              </w:rPr>
-              <w:t>tablesorter/jquery.tablesorter.min.js</w:t>
+            <w:proofErr w:type="spellStart"/>
+            <w:r>
+              <w:rPr>
+                <w:b w:val="0"/>
+                <w:sz w:val="18"/>
+                <w:szCs w:val="18"/>
+              </w:rPr>
+              <w:t>tablesorter</w:t>
+            </w:r>
+            <w:proofErr w:type="spellEnd"/>
+            <w:r>
+              <w:rPr>
+                <w:b w:val="0"/>
+                <w:sz w:val="18"/>
+                <w:szCs w:val="18"/>
+              </w:rPr>
+              <w:t>/jquery.tablesorter.min.js</w:t>
             </w:r>
           </w:p>
         </w:tc>
@@ -4441,7 +5105,7 @@
                 <w:szCs w:val="18"/>
               </w:rPr>
             </w:pPr>
-            <w:hyperlink r:id="rId27" w:history="1">
+            <w:hyperlink r:id="rId26" w:history="1">
               <w:r>
                 <w:rPr>
                   <w:rStyle w:val="Hyperlink"/>
@@ -4484,13 +5148,23 @@
               </w:rPr>
               <w:t>/</w:t>
             </w:r>
-            <w:r>
-              <w:rPr>
-                <w:b w:val="0"/>
-                <w:sz w:val="18"/>
-                <w:szCs w:val="18"/>
-              </w:rPr>
-              <w:t>jsinc/</w:t>
+            <w:proofErr w:type="spellStart"/>
+            <w:r>
+              <w:rPr>
+                <w:b w:val="0"/>
+                <w:sz w:val="18"/>
+                <w:szCs w:val="18"/>
+              </w:rPr>
+              <w:t>jsinc</w:t>
+            </w:r>
+            <w:proofErr w:type="spellEnd"/>
+            <w:r>
+              <w:rPr>
+                <w:b w:val="0"/>
+                <w:sz w:val="18"/>
+                <w:szCs w:val="18"/>
+              </w:rPr>
+              <w:t>/</w:t>
             </w:r>
             <w:r>
               <w:rPr>
@@ -4500,13 +5174,23 @@
               </w:rPr>
               <w:t>extra/</w:t>
             </w:r>
-            <w:r>
-              <w:rPr>
-                <w:b w:val="0"/>
-                <w:sz w:val="18"/>
-                <w:szCs w:val="18"/>
-              </w:rPr>
-              <w:t>jquery-inview/jquery.inview.min.js</w:t>
+            <w:proofErr w:type="spellStart"/>
+            <w:r>
+              <w:rPr>
+                <w:b w:val="0"/>
+                <w:sz w:val="18"/>
+                <w:szCs w:val="18"/>
+              </w:rPr>
+              <w:t>jquery-inview</w:t>
+            </w:r>
+            <w:proofErr w:type="spellEnd"/>
+            <w:r>
+              <w:rPr>
+                <w:b w:val="0"/>
+                <w:sz w:val="18"/>
+                <w:szCs w:val="18"/>
+              </w:rPr>
+              <w:t>/jquery.inview.min.js</w:t>
             </w:r>
           </w:p>
         </w:tc>
@@ -4522,7 +5206,7 @@
                 <w:szCs w:val="18"/>
               </w:rPr>
             </w:pPr>
-            <w:hyperlink r:id="rId28" w:history="1">
+            <w:hyperlink r:id="rId27" w:history="1">
               <w:r>
                 <w:rPr>
                   <w:rStyle w:val="Hyperlink"/>
@@ -4565,13 +5249,23 @@
               </w:rPr>
               <w:t>/</w:t>
             </w:r>
-            <w:r>
-              <w:rPr>
-                <w:b w:val="0"/>
-                <w:sz w:val="18"/>
-                <w:szCs w:val="18"/>
-              </w:rPr>
-              <w:t>jsinc/</w:t>
+            <w:proofErr w:type="spellStart"/>
+            <w:r>
+              <w:rPr>
+                <w:b w:val="0"/>
+                <w:sz w:val="18"/>
+                <w:szCs w:val="18"/>
+              </w:rPr>
+              <w:t>jsinc</w:t>
+            </w:r>
+            <w:proofErr w:type="spellEnd"/>
+            <w:r>
+              <w:rPr>
+                <w:b w:val="0"/>
+                <w:sz w:val="18"/>
+                <w:szCs w:val="18"/>
+              </w:rPr>
+              <w:t>/</w:t>
             </w:r>
             <w:r>
               <w:rPr>
@@ -4581,13 +5275,23 @@
               </w:rPr>
               <w:t>extra/</w:t>
             </w:r>
-            <w:r>
-              <w:rPr>
-                <w:b w:val="0"/>
-                <w:sz w:val="18"/>
-                <w:szCs w:val="18"/>
-              </w:rPr>
-              <w:t>jquery-visible/jquery.visible.min.js</w:t>
+            <w:proofErr w:type="spellStart"/>
+            <w:r>
+              <w:rPr>
+                <w:b w:val="0"/>
+                <w:sz w:val="18"/>
+                <w:szCs w:val="18"/>
+              </w:rPr>
+              <w:t>jquery</w:t>
+            </w:r>
+            <w:proofErr w:type="spellEnd"/>
+            <w:r>
+              <w:rPr>
+                <w:b w:val="0"/>
+                <w:sz w:val="18"/>
+                <w:szCs w:val="18"/>
+              </w:rPr>
+              <w:t>-visible/jquery.visible.min.js</w:t>
             </w:r>
           </w:p>
         </w:tc>
@@ -4643,13 +5347,23 @@
               </w:rPr>
               <w:t>/</w:t>
             </w:r>
-            <w:r>
-              <w:rPr>
-                <w:b w:val="0"/>
-                <w:sz w:val="18"/>
-                <w:szCs w:val="18"/>
-              </w:rPr>
-              <w:t>jsinc/</w:t>
+            <w:proofErr w:type="spellStart"/>
+            <w:r>
+              <w:rPr>
+                <w:b w:val="0"/>
+                <w:sz w:val="18"/>
+                <w:szCs w:val="18"/>
+              </w:rPr>
+              <w:t>jsinc</w:t>
+            </w:r>
+            <w:proofErr w:type="spellEnd"/>
+            <w:r>
+              <w:rPr>
+                <w:b w:val="0"/>
+                <w:sz w:val="18"/>
+                <w:szCs w:val="18"/>
+              </w:rPr>
+              <w:t>/</w:t>
             </w:r>
             <w:r>
               <w:rPr>
@@ -4659,13 +5373,23 @@
               </w:rPr>
               <w:t>extra/</w:t>
             </w:r>
-            <w:r>
-              <w:rPr>
-                <w:b w:val="0"/>
-                <w:sz w:val="18"/>
-                <w:szCs w:val="18"/>
-              </w:rPr>
-              <w:t>jquery-spinner/g-spinner.min.js</w:t>
+            <w:proofErr w:type="spellStart"/>
+            <w:r>
+              <w:rPr>
+                <w:b w:val="0"/>
+                <w:sz w:val="18"/>
+                <w:szCs w:val="18"/>
+              </w:rPr>
+              <w:t>jquery</w:t>
+            </w:r>
+            <w:proofErr w:type="spellEnd"/>
+            <w:r>
+              <w:rPr>
+                <w:b w:val="0"/>
+                <w:sz w:val="18"/>
+                <w:szCs w:val="18"/>
+              </w:rPr>
+              <w:t>-spinner/g-spinner.min.js</w:t>
             </w:r>
           </w:p>
         </w:tc>
@@ -4721,13 +5445,23 @@
               </w:rPr>
               <w:t>/</w:t>
             </w:r>
-            <w:r>
-              <w:rPr>
-                <w:b w:val="0"/>
-                <w:sz w:val="18"/>
-                <w:szCs w:val="18"/>
-              </w:rPr>
-              <w:t>jsinc/</w:t>
+            <w:proofErr w:type="spellStart"/>
+            <w:r>
+              <w:rPr>
+                <w:b w:val="0"/>
+                <w:sz w:val="18"/>
+                <w:szCs w:val="18"/>
+              </w:rPr>
+              <w:t>jsinc</w:t>
+            </w:r>
+            <w:proofErr w:type="spellEnd"/>
+            <w:r>
+              <w:rPr>
+                <w:b w:val="0"/>
+                <w:sz w:val="18"/>
+                <w:szCs w:val="18"/>
+              </w:rPr>
+              <w:t>/</w:t>
             </w:r>
             <w:r>
               <w:rPr>
@@ -4737,13 +5471,23 @@
               </w:rPr>
               <w:t>extra/</w:t>
             </w:r>
-            <w:r>
-              <w:rPr>
-                <w:b w:val="0"/>
-                <w:sz w:val="18"/>
-                <w:szCs w:val="18"/>
-              </w:rPr>
-              <w:t>jquery-qtip/jquery.qtip.min.js</w:t>
+            <w:proofErr w:type="spellStart"/>
+            <w:r>
+              <w:rPr>
+                <w:b w:val="0"/>
+                <w:sz w:val="18"/>
+                <w:szCs w:val="18"/>
+              </w:rPr>
+              <w:t>jquery-qtip</w:t>
+            </w:r>
+            <w:proofErr w:type="spellEnd"/>
+            <w:r>
+              <w:rPr>
+                <w:b w:val="0"/>
+                <w:sz w:val="18"/>
+                <w:szCs w:val="18"/>
+              </w:rPr>
+              <w:t>/jquery.qtip.min.js</w:t>
             </w:r>
           </w:p>
         </w:tc>
@@ -4759,7 +5503,7 @@
                 <w:szCs w:val="18"/>
               </w:rPr>
             </w:pPr>
-            <w:hyperlink r:id="rId29" w:history="1">
+            <w:hyperlink r:id="rId28" w:history="1">
               <w:r>
                 <w:rPr>
                   <w:rStyle w:val="Hyperlink"/>
@@ -4880,13 +5624,23 @@
               </w:rPr>
               <w:t>/</w:t>
             </w:r>
-            <w:r>
-              <w:rPr>
-                <w:b w:val="0"/>
-                <w:sz w:val="18"/>
-                <w:szCs w:val="18"/>
-              </w:rPr>
-              <w:t>jsinc/</w:t>
+            <w:proofErr w:type="spellStart"/>
+            <w:r>
+              <w:rPr>
+                <w:b w:val="0"/>
+                <w:sz w:val="18"/>
+                <w:szCs w:val="18"/>
+              </w:rPr>
+              <w:t>jsinc</w:t>
+            </w:r>
+            <w:proofErr w:type="spellEnd"/>
+            <w:r>
+              <w:rPr>
+                <w:b w:val="0"/>
+                <w:sz w:val="18"/>
+                <w:szCs w:val="18"/>
+              </w:rPr>
+              <w:t>/</w:t>
             </w:r>
             <w:r>
               <w:rPr>
@@ -4896,6 +5650,7 @@
               </w:rPr>
               <w:t>extra/</w:t>
             </w:r>
+            <w:proofErr w:type="spellStart"/>
             <w:r>
               <w:rPr>
                 <w:b w:val="0"/>
@@ -4910,7 +5665,16 @@
                 <w:sz w:val="18"/>
                 <w:szCs w:val="18"/>
               </w:rPr>
-              <w:t>query-flowtype/flowtype.js</w:t>
+              <w:t>query-flowtype</w:t>
+            </w:r>
+            <w:proofErr w:type="spellEnd"/>
+            <w:r>
+              <w:rPr>
+                <w:b w:val="0"/>
+                <w:sz w:val="18"/>
+                <w:szCs w:val="18"/>
+              </w:rPr>
+              <w:t>/flowtype.js</w:t>
             </w:r>
           </w:p>
         </w:tc>
@@ -4966,13 +5730,23 @@
               </w:rPr>
               <w:t>/</w:t>
             </w:r>
-            <w:r>
-              <w:rPr>
-                <w:b w:val="0"/>
-                <w:sz w:val="18"/>
-                <w:szCs w:val="18"/>
-              </w:rPr>
-              <w:t>jsinc/</w:t>
+            <w:proofErr w:type="spellStart"/>
+            <w:r>
+              <w:rPr>
+                <w:b w:val="0"/>
+                <w:sz w:val="18"/>
+                <w:szCs w:val="18"/>
+              </w:rPr>
+              <w:t>jsinc</w:t>
+            </w:r>
+            <w:proofErr w:type="spellEnd"/>
+            <w:r>
+              <w:rPr>
+                <w:b w:val="0"/>
+                <w:sz w:val="18"/>
+                <w:szCs w:val="18"/>
+              </w:rPr>
+              <w:t>/</w:t>
             </w:r>
             <w:r>
               <w:rPr>
@@ -5053,8 +5827,30 @@
         <w:rPr>
           <w:rStyle w:val="codeChar"/>
         </w:rPr>
-        <w:t>/inc/secret-example.php</w:t>
-      </w:r>
+        <w:t>/</w:t>
+      </w:r>
+      <w:proofErr w:type="spellStart"/>
+      <w:r>
+        <w:rPr>
+          <w:rStyle w:val="codeChar"/>
+        </w:rPr>
+        <w:t>inc</w:t>
+      </w:r>
+      <w:proofErr w:type="spellEnd"/>
+      <w:r>
+        <w:rPr>
+          <w:rStyle w:val="codeChar"/>
+        </w:rPr>
+        <w:t>/secret-</w:t>
+      </w:r>
+      <w:proofErr w:type="spellStart"/>
+      <w:r>
+        <w:rPr>
+          <w:rStyle w:val="codeChar"/>
+        </w:rPr>
+        <w:t>example.php</w:t>
+      </w:r>
+      <w:proofErr w:type="spellEnd"/>
       <w:r>
         <w:t xml:space="preserve"> as </w:t>
       </w:r>
@@ -5068,8 +5864,30 @@
         <w:rPr>
           <w:rStyle w:val="codeChar"/>
         </w:rPr>
-        <w:t>/inc/secret.php</w:t>
-      </w:r>
+        <w:t>/</w:t>
+      </w:r>
+      <w:proofErr w:type="spellStart"/>
+      <w:r>
+        <w:rPr>
+          <w:rStyle w:val="codeChar"/>
+        </w:rPr>
+        <w:t>inc</w:t>
+      </w:r>
+      <w:proofErr w:type="spellEnd"/>
+      <w:r>
+        <w:rPr>
+          <w:rStyle w:val="codeChar"/>
+        </w:rPr>
+        <w:t>/</w:t>
+      </w:r>
+      <w:proofErr w:type="spellStart"/>
+      <w:r>
+        <w:rPr>
+          <w:rStyle w:val="codeChar"/>
+        </w:rPr>
+        <w:t>secret.php</w:t>
+      </w:r>
+      <w:proofErr w:type="spellEnd"/>
     </w:p>
     <w:p>
       <w:pPr>
@@ -5092,8 +5910,30 @@
         <w:rPr>
           <w:rStyle w:val="codeChar"/>
         </w:rPr>
-        <w:t>/inc/secret.php</w:t>
-      </w:r>
+        <w:t>/</w:t>
+      </w:r>
+      <w:proofErr w:type="spellStart"/>
+      <w:r>
+        <w:rPr>
+          <w:rStyle w:val="codeChar"/>
+        </w:rPr>
+        <w:t>inc</w:t>
+      </w:r>
+      <w:proofErr w:type="spellEnd"/>
+      <w:r>
+        <w:rPr>
+          <w:rStyle w:val="codeChar"/>
+        </w:rPr>
+        <w:t>/</w:t>
+      </w:r>
+      <w:proofErr w:type="spellStart"/>
+      <w:r>
+        <w:rPr>
+          <w:rStyle w:val="codeChar"/>
+        </w:rPr>
+        <w:t>secret.php</w:t>
+      </w:r>
+      <w:proofErr w:type="spellEnd"/>
       <w:r>
         <w:t xml:space="preserve"> and provid</w:t>
       </w:r>
@@ -5121,7 +5961,16 @@
     </w:p>
     <w:p>
       <w:r>
-        <w:t xml:space="preserve">create an .htaccess file in </w:t>
+        <w:lastRenderedPageBreak/>
+        <w:t>create an .</w:t>
+      </w:r>
+      <w:proofErr w:type="spellStart"/>
+      <w:r>
+        <w:t>htaccess</w:t>
+      </w:r>
+      <w:proofErr w:type="spellEnd"/>
+      <w:r>
+        <w:t xml:space="preserve"> file in </w:t>
       </w:r>
       <w:r>
         <w:t>$RAPPORT</w:t>
@@ -5134,6 +5983,7 @@
       <w:pPr>
         <w:pStyle w:val="code"/>
       </w:pPr>
+      <w:proofErr w:type="spellStart"/>
       <w:r>
         <w:rPr>
           <w:rStyle w:val="HTMLCode"/>
@@ -5141,34 +5991,66 @@
           <w:sz w:val="16"/>
           <w:szCs w:val="18"/>
         </w:rPr>
-        <w:lastRenderedPageBreak/>
-        <w:t>DirectoryIndex index.php</w:t>
-      </w:r>
+        <w:t>DirectoryIndex</w:t>
+      </w:r>
+      <w:proofErr w:type="spellEnd"/>
+      <w:r>
+        <w:rPr>
+          <w:rStyle w:val="HTMLCode"/>
+          <w:rFonts w:eastAsia="MS UI Gothic" w:cstheme="minorBidi"/>
+          <w:sz w:val="16"/>
+          <w:szCs w:val="18"/>
+        </w:rPr>
+        <w:t xml:space="preserve"> </w:t>
+      </w:r>
+      <w:proofErr w:type="spellStart"/>
+      <w:r>
+        <w:rPr>
+          <w:rStyle w:val="HTMLCode"/>
+          <w:rFonts w:eastAsia="MS UI Gothic" w:cstheme="minorBidi"/>
+          <w:sz w:val="16"/>
+          <w:szCs w:val="18"/>
+        </w:rPr>
+        <w:t>index.php</w:t>
+      </w:r>
+      <w:proofErr w:type="spellEnd"/>
     </w:p>
     <w:p>
       <w:pPr>
         <w:pStyle w:val="code"/>
       </w:pPr>
-      <w:r>
-        <w:t>RewriteEngine On</w:t>
+      <w:proofErr w:type="spellStart"/>
+      <w:r>
+        <w:t>RewriteEngine</w:t>
+      </w:r>
+      <w:proofErr w:type="spellEnd"/>
+      <w:r>
+        <w:t xml:space="preserve"> On</w:t>
       </w:r>
     </w:p>
     <w:p>
       <w:pPr>
         <w:pStyle w:val="code"/>
       </w:pPr>
-      <w:r>
-        <w:t xml:space="preserve">RewriteRule </w:t>
+      <w:proofErr w:type="spellStart"/>
+      <w:r>
+        <w:t>RewriteRule</w:t>
+      </w:r>
+      <w:proofErr w:type="spellEnd"/>
+      <w:r>
+        <w:t xml:space="preserve"> </w:t>
       </w:r>
       <w:r>
         <w:t>/</w:t>
       </w:r>
+      <w:proofErr w:type="spellStart"/>
       <w:r>
         <w:t>index.</w:t>
       </w:r>
       <w:r>
         <w:t>php</w:t>
       </w:r>
+      <w:proofErr w:type="spellEnd"/>
       <w:r>
         <w:t xml:space="preserve"> /</w:t>
       </w:r>
@@ -5234,8 +6116,16 @@
         <w:rPr>
           <w:rStyle w:val="codeChar"/>
         </w:rPr>
-        <w:t>/www/index.php</w:t>
-      </w:r>
+        <w:t>/www/</w:t>
+      </w:r>
+      <w:proofErr w:type="spellStart"/>
+      <w:r>
+        <w:rPr>
+          <w:rStyle w:val="codeChar"/>
+        </w:rPr>
+        <w:t>index.php</w:t>
+      </w:r>
+      <w:proofErr w:type="spellEnd"/>
       <w:r>
         <w:t xml:space="preserve"> to add the https served pages</w:t>
       </w:r>
@@ -5264,7 +6154,15 @@
         <w:pStyle w:val="code"/>
       </w:pPr>
       <w:r>
-        <w:t>&lt;p&gt;&lt;a href="https://dev.rappport:8443/"&gt;Rapport&lt;/a&gt;</w:t>
+        <w:t xml:space="preserve">&lt;p&gt;&lt;a </w:t>
+      </w:r>
+      <w:proofErr w:type="spellStart"/>
+      <w:r>
+        <w:t>href</w:t>
+      </w:r>
+      <w:proofErr w:type="spellEnd"/>
+      <w:r>
+        <w:t>="https://dev.rappport:8443/"&gt;Rapport&lt;/a&gt;</w:t>
       </w:r>
     </w:p>
     <w:p>
@@ -5279,7 +6177,15 @@
     </w:p>
     <w:p>
       <w:r>
-        <w:t>This couldn’t be simpler – just click the start apache button</w:t>
+        <w:t xml:space="preserve">This couldn’t be simpler – just click the start </w:t>
+      </w:r>
+      <w:proofErr w:type="spellStart"/>
+      <w:r>
+        <w:t>apache</w:t>
+      </w:r>
+      <w:proofErr w:type="spellEnd"/>
+      <w:r>
+        <w:t xml:space="preserve"> button</w:t>
       </w:r>
     </w:p>
     <w:p>
@@ -5305,7 +6211,7 @@
                     </pic:cNvPicPr>
                   </pic:nvPicPr>
                   <pic:blipFill>
-                    <a:blip r:embed="rId30">
+                    <a:blip r:embed="rId29">
                       <a:extLst>
                         <a:ext uri="{28A0092B-C50C-407E-A947-70E740481C1C}">
                           <a14:useLocalDpi xmlns:a14="http://schemas.microsoft.com/office/drawing/2010/main" val="0"/>
@@ -5345,7 +6251,7 @@
           <w:noProof/>
         </w:rPr>
         <w:drawing>
-          <wp:inline distT="0" distB="0" distL="0" distR="0" wp14:anchorId="1CEE8471" wp14:editId="77FDBE5C">
+          <wp:inline distT="0" distB="0" distL="0" distR="0" wp14:anchorId="1CEE8471" wp14:editId="31EB44DD">
             <wp:extent cx="2958503" cy="2773082"/>
             <wp:effectExtent l="0" t="0" r="0" b="8255"/>
             <wp:docPr id="3" name="Picture 3"/>
@@ -5362,7 +6268,7 @@
                     </pic:cNvPicPr>
                   </pic:nvPicPr>
                   <pic:blipFill>
-                    <a:blip r:embed="rId31" cstate="print">
+                    <a:blip r:embed="rId30" cstate="print">
                       <a:extLst>
                         <a:ext uri="{28A0092B-C50C-407E-A947-70E740481C1C}">
                           <a14:useLocalDpi xmlns:a14="http://schemas.microsoft.com/office/drawing/2010/main" val="0"/>
@@ -5437,7 +6343,7 @@
       </w:pPr>
     </w:p>
     <w:sectPr>
-      <w:footerReference w:type="default" r:id="rId32"/>
+      <w:footerReference w:type="default" r:id="rId31"/>
       <w:pgSz w:w="11906" w:h="16838"/>
       <w:pgMar w:top="1440" w:right="1440" w:bottom="1440" w:left="1440" w:header="708" w:footer="708" w:gutter="0"/>
       <w:cols w:space="708"/>
@@ -6004,7 +6910,7 @@
   <w:abstractNum w:abstractNumId="4" w15:restartNumberingAfterBreak="0">
     <w:nsid w:val="5C86542A"/>
     <w:multiLevelType w:val="hybridMultilevel"/>
-    <w:tmpl w:val="57D01926"/>
+    <w:tmpl w:val="2FD43878"/>
     <w:lvl w:ilvl="0" w:tplc="48CAF36E">
       <w:start w:val="1"/>
       <w:numFmt w:val="decimal"/>
@@ -6017,14 +6923,17 @@
         <w:rFonts w:hint="default"/>
       </w:rPr>
     </w:lvl>
-    <w:lvl w:ilvl="1" w:tplc="08090019">
+    <w:lvl w:ilvl="1" w:tplc="08090001">
       <w:start w:val="1"/>
-      <w:numFmt w:val="lowerLetter"/>
-      <w:lvlText w:val="%2."/>
+      <w:numFmt w:val="bullet"/>
+      <w:lvlText w:val=""/>
       <w:lvlJc w:val="left"/>
       <w:pPr>
         <w:ind w:left="1440" w:hanging="360"/>
       </w:pPr>
+      <w:rPr>
+        <w:rFonts w:ascii="Symbol" w:hAnsi="Symbol" w:hint="default"/>
+      </w:rPr>
     </w:lvl>
     <w:lvl w:ilvl="2" w:tplc="0809001B" w:tentative="1">
       <w:start w:val="1"/>

</xml_diff>